<commit_message>
Python: lectura automática de placas con la cámara, cámara por dirección IP y pruebas
Co-Authored-By: Claude Sonnet 5.5 <noreply@anthropic.com>
Claude-Session: https://claude.ai/code/session_01WLZ2XuhTWTWujj27otXiLx
</commit_message>
<xml_diff>
--- a/docs/documentos/11 Manual del sistema Python.docx
+++ b/docs/documentos/11 Manual del sistema Python.docx
@@ -487,7 +487,7 @@
                 <w:i w:val="0"/>
                 <w:sz w:val="18"/>
               </w:rPr>
-              <w:t>Probadas: 15 pruebas de reglas y 6 de portería virtual y placas pasan</w:t>
+              <w:t>Probadas: 15 pruebas de reglas, 6 de portería virtual y 5 de lectura de placas pasan</w:t>
             </w:r>
           </w:p>
         </w:tc>
@@ -609,7 +609,7 @@
                 <w:i w:val="0"/>
                 <w:sz w:val="18"/>
               </w:rPr>
-              <w:t>Probado: 7 pruebas pasan, incluida la revisión por placa distinta</w:t>
+              <w:t>Probado: 9 pruebas pasan, incluida la revisión por placa distinta o leída por la cámara</w:t>
             </w:r>
           </w:p>
         </w:tc>
@@ -703,7 +703,7 @@
                 <w:i w:val="0"/>
                 <w:sz w:val="18"/>
               </w:rPr>
-              <w:t>Cámara y reconocimiento facial (face_recognition)</w:t>
+              <w:t>Cámara, reconocimiento facial (face_recognition) y lectura de placas con la cámara</w:t>
             </w:r>
           </w:p>
         </w:tc>
@@ -731,7 +731,7 @@
                 <w:i w:val="0"/>
                 <w:sz w:val="18"/>
               </w:rPr>
-              <w:t>No probados: requieren el computador del equipo</w:t>
+              <w:t>No probados: requieren el computador del equipo. La lectura de la placa sí se probó con una imagen generada</w:t>
             </w:r>
           </w:p>
         </w:tc>
@@ -1122,7 +1122,7 @@
                 <w:i w:val="0"/>
                 <w:sz w:val="18"/>
               </w:rPr>
-              <w:t>pip install customtkinter Pillow opencv-python Click 'setuptools&lt;81' pyserial</w:t>
+              <w:t>pip install customtkinter Pillow opencv-python Click 'setuptools&lt;81' pyserial easyocr</w:t>
             </w:r>
           </w:p>
         </w:tc>
@@ -1150,7 +1150,7 @@
                 <w:i w:val="0"/>
                 <w:sz w:val="18"/>
               </w:rPr>
-              <w:t>Ventana, imágenes, cámara y comunicación con el Arduino</w:t>
+              <w:t>Ventana, imágenes, cámara, comunicación con el Arduino y lectura de placas</w:t>
             </w:r>
           </w:p>
         </w:tc>
@@ -2502,7 +2502,7 @@
           <w:i w:val="0"/>
           <w:sz w:val="24"/>
         </w:rPr>
-        <w:t>Si el guarda lee la placa del vehículo, la escribe en el campo de placa antes de validar. Cuando la placa no coincide con la registrada a esa persona, el sistema no decide: pide al guarda que permita o niegue.</w:t>
+        <w:t>La placa se lee sola con la cámara (con EasyOCR o Tesseract instalados) o se escribe a mano. Sirve cualquier cámara USB y también una cámara IP o el celular, pegando su dirección en la ventana. Cuando la placa no coincide con la registrada a esa persona, el sistema no decide: pide al guarda que permita o niegue.</w:t>
       </w:r>
     </w:p>
     <w:p>

</xml_diff>